<commit_message>
Add zodiac wheel animation to horoscope article
- Анимация: колесо из 12 животных вращается, замедляется и
  останавливается на годе Козы 羊 (kitajskij-goroskop-animaciya.gif)
- Статичный постер встроен в Word (раздел «что такое зодиак»);
  gif — отдельным файлом для загрузки в Дзен

Co-Authored-By: Claude Opus 4.8 <noreply@anthropic.com>
Claude-Session: https://claude.ai/code/session_01RVXEYDcJcutEhTE5TPkTLr
</commit_message>
<xml_diff>
--- a/content/blog/kitajskij-goroskop.DZEN.docx
+++ b/content/blog/kitajskij-goroskop.DZEN.docx
@@ -323,108 +323,13 @@
     </w:p>
     <w:p>
       <w:pPr>
-        <w:pStyle w:val="Heading1"/>
-        <w:spacing w:after="120" w:before="360"/>
-      </w:pPr>
-      <w:r>
-        <w:rPr>
-          <w:b/>
-          <w:bCs/>
-          <w:color w:val="2C2420"/>
-          <w:sz w:val="30"/>
-          <w:szCs w:val="30"/>
-        </w:rPr>
-        <w:t xml:space="preserve">Легенда</w:t>
-      </w:r>
-      <w:r>
-        <w:rPr>
-          <w:b/>
-          <w:bCs/>
-          <w:i/>
-          <w:iCs/>
-          <w:color w:val="A41E3A"/>
-          <w:sz w:val="30"/>
-          <w:szCs w:val="30"/>
-        </w:rPr>
-        <w:t xml:space="preserve"> о Великом заплыве</w:t>
-      </w:r>
-    </w:p>
-    <w:p>
-      <w:pPr>
-        <w:spacing w:after="150"/>
-      </w:pPr>
-      <w:r>
-        <w:rPr>
-          <w:color w:val="5A4F45"/>
-          <w:sz w:val="22"/>
-          <w:szCs w:val="22"/>
-        </w:rPr>
-        <w:t xml:space="preserve">Откуда взялся именно такой порядок? Самая известная легенда рассказывает о состязании. Нефритовый император (玉帝) объявил гонку: первые двенадцать животных, что переправятся через реку, получат по году в календаре.</w:t>
-      </w:r>
-    </w:p>
-    <w:p>
-      <w:pPr>
-        <w:spacing w:after="150"/>
-      </w:pPr>
-      <w:r>
-        <w:rPr>
-          <w:color w:val="5A4F45"/>
-          <w:sz w:val="22"/>
-          <w:szCs w:val="22"/>
-        </w:rPr>
-        <w:t xml:space="preserve">Хитрая Крыса не умела хорошо плавать и упросила добродушного Быка перевезти её. У самого берега она спрыгнула с его спины и первой пересекла финиш — так Крыса стала первой, а трудяга Бык вторым. Дальше приплыли Тигр и Кролик, а величественный Дракон, хоть и мог долететь, задержался, потому что помогал другим, — и был лишь пятым. Кот же, по одной из версий, проспал гонку (Крыса его не разбудила) — и в зодиак не попал. Поэтому, говорят китайцы, кошки и мыши до сих пор не в ладах.</w:t>
-      </w:r>
-    </w:p>
-    <w:p>
-      <w:pPr>
-        <w:pStyle w:val="Heading1"/>
-        <w:spacing w:after="120" w:before="360"/>
-      </w:pPr>
-      <w:r>
-        <w:rPr>
-          <w:b/>
-          <w:bCs/>
-          <w:color w:val="2C2420"/>
-          <w:sz w:val="30"/>
-          <w:szCs w:val="30"/>
-        </w:rPr>
-        <w:t xml:space="preserve">12 животных</w:t>
-      </w:r>
-      <w:r>
-        <w:rPr>
-          <w:b/>
-          <w:bCs/>
-          <w:i/>
-          <w:iCs/>
-          <w:color w:val="A41E3A"/>
-          <w:sz w:val="30"/>
-          <w:szCs w:val="30"/>
-        </w:rPr>
-        <w:t xml:space="preserve"> и их характеры</w:t>
-      </w:r>
-    </w:p>
-    <w:p>
-      <w:pPr>
-        <w:spacing w:after="150"/>
-      </w:pPr>
-      <w:r>
-        <w:rPr>
-          <w:color w:val="5A4F45"/>
-          <w:sz w:val="22"/>
-          <w:szCs w:val="22"/>
-        </w:rPr>
-        <w:t xml:space="preserve">У каждого животного — свой «характер», который, по поверью, передаётся рождённым в его год. Вот краткая шпаргалка по всем двенадцати.</w:t>
-      </w:r>
-    </w:p>
-    <w:p>
-      <w:pPr>
         <w:spacing w:after="100" w:before="200"/>
         <w:jc w:val="center"/>
       </w:pPr>
       <w:r>
         <w:drawing>
           <wp:inline distT="0" distB="0" distL="0" distR="0">
-            <wp:extent cx="5334000" cy="2305050"/>
+            <wp:extent cx="3619500" cy="3619500"/>
             <wp:effectExtent t="0" r="0" b="0" l="0"/>
             <wp:docPr id="1" name="" descr="" title=""/>
             <wp:cNvGraphicFramePr>
@@ -449,6 +354,162 @@
                   <pic:spPr bwMode="auto">
                     <a:xfrm>
                       <a:off x="0" y="0"/>
+                      <a:ext cx="3619500" cy="3619500"/>
+                    </a:xfrm>
+                    <a:prstGeom prst="rect">
+                      <a:avLst/>
+                    </a:prstGeom>
+                  </pic:spPr>
+                </pic:pic>
+              </a:graphicData>
+            </a:graphic>
+          </wp:inline>
+        </w:drawing>
+      </w:r>
+    </w:p>
+    <w:p>
+      <w:pPr>
+        <w:spacing w:after="200" w:before="60"/>
+        <w:jc w:val="center"/>
+      </w:pPr>
+      <w:r>
+        <w:rPr>
+          <w:caps/>
+          <w:color w:val="A41E3A"/>
+          <w:sz w:val="16"/>
+          <w:szCs w:val="16"/>
+        </w:rPr>
+        <w:t xml:space="preserve">▲ колесо зодиака: 2027 — год Козы (в статью загрузите gif-анимацию)</w:t>
+      </w:r>
+    </w:p>
+    <w:p>
+      <w:pPr>
+        <w:pStyle w:val="Heading1"/>
+        <w:spacing w:after="120" w:before="360"/>
+      </w:pPr>
+      <w:r>
+        <w:rPr>
+          <w:b/>
+          <w:bCs/>
+          <w:color w:val="2C2420"/>
+          <w:sz w:val="30"/>
+          <w:szCs w:val="30"/>
+        </w:rPr>
+        <w:t xml:space="preserve">Легенда</w:t>
+      </w:r>
+      <w:r>
+        <w:rPr>
+          <w:b/>
+          <w:bCs/>
+          <w:i/>
+          <w:iCs/>
+          <w:color w:val="A41E3A"/>
+          <w:sz w:val="30"/>
+          <w:szCs w:val="30"/>
+        </w:rPr>
+        <w:t xml:space="preserve"> о Великом заплыве</w:t>
+      </w:r>
+    </w:p>
+    <w:p>
+      <w:pPr>
+        <w:spacing w:after="150"/>
+      </w:pPr>
+      <w:r>
+        <w:rPr>
+          <w:color w:val="5A4F45"/>
+          <w:sz w:val="22"/>
+          <w:szCs w:val="22"/>
+        </w:rPr>
+        <w:t xml:space="preserve">Откуда взялся именно такой порядок? Самая известная легенда рассказывает о состязании. Нефритовый император (玉帝) объявил гонку: первые двенадцать животных, что переправятся через реку, получат по году в календаре.</w:t>
+      </w:r>
+    </w:p>
+    <w:p>
+      <w:pPr>
+        <w:spacing w:after="150"/>
+      </w:pPr>
+      <w:r>
+        <w:rPr>
+          <w:color w:val="5A4F45"/>
+          <w:sz w:val="22"/>
+          <w:szCs w:val="22"/>
+        </w:rPr>
+        <w:t xml:space="preserve">Хитрая Крыса не умела хорошо плавать и упросила добродушного Быка перевезти её. У самого берега она спрыгнула с его спины и первой пересекла финиш — так Крыса стала первой, а трудяга Бык вторым. Дальше приплыли Тигр и Кролик, а величественный Дракон, хоть и мог долететь, задержался, потому что помогал другим, — и был лишь пятым. Кот же, по одной из версий, проспал гонку (Крыса его не разбудила) — и в зодиак не попал. Поэтому, говорят китайцы, кошки и мыши до сих пор не в ладах.</w:t>
+      </w:r>
+    </w:p>
+    <w:p>
+      <w:pPr>
+        <w:pStyle w:val="Heading1"/>
+        <w:spacing w:after="120" w:before="360"/>
+      </w:pPr>
+      <w:r>
+        <w:rPr>
+          <w:b/>
+          <w:bCs/>
+          <w:color w:val="2C2420"/>
+          <w:sz w:val="30"/>
+          <w:szCs w:val="30"/>
+        </w:rPr>
+        <w:t xml:space="preserve">12 животных</w:t>
+      </w:r>
+      <w:r>
+        <w:rPr>
+          <w:b/>
+          <w:bCs/>
+          <w:i/>
+          <w:iCs/>
+          <w:color w:val="A41E3A"/>
+          <w:sz w:val="30"/>
+          <w:szCs w:val="30"/>
+        </w:rPr>
+        <w:t xml:space="preserve"> и их характеры</w:t>
+      </w:r>
+    </w:p>
+    <w:p>
+      <w:pPr>
+        <w:spacing w:after="150"/>
+      </w:pPr>
+      <w:r>
+        <w:rPr>
+          <w:color w:val="5A4F45"/>
+          <w:sz w:val="22"/>
+          <w:szCs w:val="22"/>
+        </w:rPr>
+        <w:t xml:space="preserve">У каждого животного — свой «характер», который, по поверью, передаётся рождённым в его год. Вот краткая шпаргалка по всем двенадцати.</w:t>
+      </w:r>
+    </w:p>
+    <w:p>
+      <w:pPr>
+        <w:spacing w:after="100" w:before="200"/>
+        <w:jc w:val="center"/>
+      </w:pPr>
+      <w:r>
+        <w:drawing>
+          <wp:inline distT="0" distB="0" distL="0" distR="0">
+            <wp:extent cx="5334000" cy="2305050"/>
+            <wp:effectExtent t="0" r="0" b="0" l="0"/>
+            <wp:docPr id="1" name="" descr="" title=""/>
+            <wp:cNvGraphicFramePr>
+              <a:graphicFrameLocks xmlns:a="http://schemas.openxmlformats.org/drawingml/2006/main" noChangeAspect="1"/>
+            </wp:cNvGraphicFramePr>
+            <a:graphic xmlns:a="http://schemas.openxmlformats.org/drawingml/2006/main">
+              <a:graphicData uri="http://schemas.openxmlformats.org/drawingml/2006/picture">
+                <pic:pic xmlns:pic="http://schemas.openxmlformats.org/drawingml/2006/picture">
+                  <pic:nvPicPr>
+                    <pic:cNvPr id="0" name="" descr=""/>
+                    <pic:cNvPicPr>
+                      <a:picLocks noChangeAspect="1" noChangeArrowheads="1"/>
+                    </pic:cNvPicPr>
+                  </pic:nvPicPr>
+                  <pic:blipFill>
+                    <a:blip r:embed="rId9" cstate="none"/>
+                    <a:srcRect/>
+                    <a:stretch>
+                      <a:fillRect/>
+                    </a:stretch>
+                  </pic:blipFill>
+                  <pic:spPr bwMode="auto">
+                    <a:xfrm>
+                      <a:off x="0" y="0"/>
                       <a:ext cx="5334000" cy="2305050"/>
                     </a:xfrm>
                     <a:prstGeom prst="rect">
@@ -555,7 +616,7 @@
                     </pic:cNvPicPr>
                   </pic:nvPicPr>
                   <pic:blipFill>
-                    <a:blip r:embed="rId9" cstate="none"/>
+                    <a:blip r:embed="rId10" cstate="none"/>
                     <a:srcRect/>
                     <a:stretch>
                       <a:fillRect/>

</xml_diff>